<commit_message>
writing for June 10 and 11th
</commit_message>
<xml_diff>
--- a/writing/2025-05-31_draft.docx
+++ b/writing/2025-05-31_draft.docx
@@ -1386,10 +1386,7 @@
         <w:t xml:space="preserve">. </w:t>
       </w:r>
       <w:r>
-        <w:t>Therefore, neopterin is likely a valuable indicator of intestinal immune activity</w:t>
-      </w:r>
-      <w:r>
-        <w:t xml:space="preserve"> and bidirectional relationships between host immunity and the gut microbes. </w:t>
+        <w:t xml:space="preserve">Therefore, neopterin is likely a valuable indicator of intestinal immune activity and bidirectional relationships between host immunity and the gut microbes. </w:t>
       </w:r>
       <w:r>
         <w:t xml:space="preserve">Neopterin can also be measured in urine </w:t>
@@ -4316,10 +4313,7 @@
     </w:p>
     <w:p>
       <w:r>
-        <w:t>The interaction between temperature and immune activation supports the idea that heat-driven taxonomic shifts influence the relationship between the gut microbiome and host immunity.</w:t>
-      </w:r>
-      <w:r>
-        <w:t xml:space="preserve"> Specifically, </w:t>
+        <w:t xml:space="preserve">The interaction between temperature and immune activation supports the idea that heat-driven taxonomic shifts influence the relationship between the gut microbiome and host immunity. Specifically, </w:t>
       </w:r>
       <w:r>
         <w:t xml:space="preserve">the decline in obligate anaerobes </w:t>
@@ -4981,91 +4975,16 @@
         <w:ind w:firstLine="720"/>
       </w:pPr>
       <w:r>
-        <w:t xml:space="preserve">Taken together, these findings provide </w:t>
-      </w:r>
-      <w:r>
-        <w:t xml:space="preserve">robust </w:t>
-      </w:r>
-      <w:r>
-        <w:t xml:space="preserve">support for a heat-induced physiological cascade that </w:t>
-      </w:r>
-      <w:r>
-        <w:t>affects</w:t>
-      </w:r>
-      <w:r>
-        <w:t xml:space="preserve"> microbiome composition and disrupts immune homeostasis (Fig. 3F). The interaction effects reveal three key patterns: (1) heat-driven loss of obligate anaerobes may increase macrophage activation by reducing microbial anti-inflammatory signaling; (2) elevated immune activation further exacerbates the decline of obligate taxa and promotes a shift toward facultative taxa; and (3) the expansion of facultative taxa may, in turn, heighten immune activation. While the directionality among these relationships cannot be definitively established, the results highlight how each component can reinforce the others, creating a feedback loop during periods of heat stress.</w:t>
-      </w:r>
-      <w:r>
-        <w:t xml:space="preserve"> </w:t>
-      </w:r>
-      <w:r>
-        <w:t>These results also provide compelling evidence that capuchins are already experiencing episodes of heat stress that may impact long-term health and fitness by increasing the risk of chronic inflammatory disease. Future work should incorporate additional immune biomarkers</w:t>
-      </w:r>
-      <w:r>
-        <w:t xml:space="preserve"> that directly assess inflammation as neopterin </w:t>
-      </w:r>
-      <w:r>
-        <w:t xml:space="preserve">primarily reflects macrophage activation and represents </w:t>
-      </w:r>
-      <w:r>
-        <w:t xml:space="preserve">only </w:t>
-      </w:r>
-      <w:r>
-        <w:t xml:space="preserve">one of </w:t>
-      </w:r>
-      <w:r>
-        <w:t xml:space="preserve">the </w:t>
-      </w:r>
-      <w:r>
-        <w:t>many mechanisms linking immunity and the gut microbiome</w:t>
-      </w:r>
-      <w:r>
-        <w:t xml:space="preserve">. </w:t>
-      </w:r>
-      <w:r>
-        <w:t xml:space="preserve">Further research is </w:t>
-      </w:r>
-      <w:r>
-        <w:t>necessary</w:t>
-      </w:r>
-      <w:r>
-        <w:t xml:space="preserve"> to determine the duration and intensity of heat exposure required to elicit these microbiome–immune effects, and whether </w:t>
-      </w:r>
-      <w:r>
-        <w:t>they could</w:t>
-      </w:r>
-      <w:r>
-        <w:t xml:space="preserve"> have consequences for host health and fitness.</w:t>
-      </w:r>
-      <w:r>
-        <w:t xml:space="preserve"> Further,</w:t>
-      </w:r>
-      <w:r>
-        <w:t xml:space="preserve"> </w:t>
-      </w:r>
-      <w:r>
-        <w:t>c</w:t>
-      </w:r>
-      <w:r>
-        <w:t>omparative studies in other wild specie</w:t>
-      </w:r>
-      <w:r>
-        <w:t xml:space="preserve">s, </w:t>
-      </w:r>
-      <w:r>
-        <w:t>particularly those with narrower thermal tolerances</w:t>
-      </w:r>
-      <w:r>
-        <w:t xml:space="preserve">, </w:t>
-      </w:r>
-      <w:r>
-        <w:t xml:space="preserve">are also </w:t>
-      </w:r>
-      <w:r>
-        <w:t>important</w:t>
-      </w:r>
-      <w:r>
-        <w:t xml:space="preserve"> to assess whether these patterns are specific to capuchins or represent broader responses among endotherms to rising temperatures.</w:t>
+        <w:t xml:space="preserve">Taken together, these findings provide robust support for a heat-induced physiological cascade that affects microbiome composition and disrupts immune homeostasis (Fig. 3F). The interaction effects reveal three key patterns: (1) heat-driven loss of obligate anaerobes may increase macrophage activation by reducing microbial anti-inflammatory signaling; (2) elevated immune activation exacerbates the decline of obligate taxa and promotes a shift toward facultative taxa; and (3) the expansion of facultative taxa may, in turn, heighten immune activation. While </w:t>
+      </w:r>
+      <w:r>
+        <w:t xml:space="preserve">we cannot demonstrate directionality among these relationships, </w:t>
+      </w:r>
+      <w:r>
+        <w:t>the results highlight how each component can reinforce the others, creating a feedback loop during periods of heat stress.</w:t>
+      </w:r>
+      <w:r>
+        <w:t xml:space="preserve"> These results also provide compelling evidence that capuchins are already experiencing episodes of heat stress that may impact long-term health and fitness by increasing the risk of chronic inflammatory disease. Future work should incorporate additional immune biomarkers that directly assess inflammation as neopterin primarily reflects macrophage activation and represents only one of the many mechanisms linking immunity and the gut microbiome. Further research is necessary to determine the duration and intensity of heat exposure required to elicit these microbiome–immune effects, and whether they could have consequences for host health and fitness. Further, comparative studies in other wild species, particularly those with narrower thermal tolerances, are also important to assess whether these patterns are specific to capuchins or represent broader responses among endotherms to rising temperatures.</w:t>
       </w:r>
     </w:p>
     <w:p>
@@ -5084,35 +5003,221 @@
         <w:pStyle w:val="NormalWeb"/>
       </w:pPr>
       <w:r>
-        <w:t xml:space="preserve">Our results highlight the crucial role of temperature in shaping essential gut microbiome functions in wild endotherms and demonstrate how temperature is related to microbiome-immune interactions that may affect host immune tolerance of gut microbes. These findings </w:t>
+        <w:t xml:space="preserve">Our results </w:t>
+      </w:r>
+      <w:r>
+        <w:t xml:space="preserve">highlight </w:t>
+      </w:r>
+      <w:r>
+        <w:t>the pivotal role of temperature in shaping gut microbiome function and its interaction with host immunity in a wild primate species. Although some microbial responses to elevated temperature</w:t>
+      </w:r>
+      <w:r>
+        <w:t xml:space="preserve">s </w:t>
+      </w:r>
+      <w:r>
+        <w:t xml:space="preserve">may help preserve microbiome stability </w:t>
+      </w:r>
+      <w:r>
+        <w:t>during</w:t>
+      </w:r>
+      <w:r>
+        <w:t xml:space="preserve"> short</w:t>
+      </w:r>
+      <w:r>
+        <w:t>-</w:t>
+      </w:r>
+      <w:r>
+        <w:t>term</w:t>
+      </w:r>
+      <w:r>
+        <w:t xml:space="preserve"> periods of high temperatures, most of the observed changes in taxonomy and metabolic pathways </w:t>
+      </w:r>
+      <w:r>
+        <w:t xml:space="preserve">are unlikely to </w:t>
       </w:r>
       <w:r>
         <w:lastRenderedPageBreak/>
-        <w:t>provide key insight into how rising temperatures due to climate change may affect wild animals via microbiome-mediated mechanisms</w:t>
+        <w:t>be sustainable over longer periods and may compromise essential microbial functions</w:t>
+      </w:r>
+      <w:r>
+        <w:t xml:space="preserve">. </w:t>
+      </w:r>
+      <w:r>
+        <w:t>These alterations, along with their association with increased neopterin levels, indicate that capuchins are experiencing periods of heat stress that may disrupt microbiome–immune homeostasis.</w:t>
+      </w:r>
+      <w:r>
+        <w:t xml:space="preserve"> </w:t>
+      </w:r>
+      <w:r>
+        <w:t>If prolonged, such changes could erode host tolerance toward gut microbes and increase the risk of chronic gut inflammation. Our findings likely represent some of the earliest evidence of climate-induced heat stress mediated by the gut microbiome in a wild population. They offer critical insight into how rising temperatures may impact animal health through microbiome-linked pathways, with broader implications for wildlife facing accelerating climate change.</w:t>
       </w:r>
     </w:p>
     <w:p>
       <w:pPr>
         <w:pStyle w:val="NormalWeb"/>
       </w:pPr>
-      <w:r>
-        <w:t>are likely seeing the some of the first consequences of heat stress mediated by the gut microbiome!!!!!!!!!!</w:t>
-      </w:r>
     </w:p>
     <w:p>
       <w:pPr>
         <w:pStyle w:val="NormalWeb"/>
       </w:pPr>
-      <w:r>
-        <w:t>First time we’ve observed something like this in the wild!</w:t>
-      </w:r>
     </w:p>
     <w:p>
       <w:pPr>
         <w:pStyle w:val="NormalWeb"/>
       </w:pPr>
       <w:r>
+        <w:t>Although some microbial responses to elevated temperature may buffer short-term disruptions, most observed shifts—particularly the decline in obligate anaerobes and changes in microbial metabolism—suggest compromised microbiome stability under sustained heat. These alterations, along with their association with increased neopterin levels, indicate that capuchins are experiencing periods of heat stress that may disrupt microbiome–immune homeostasis. If prolonged, such changes could erode host tolerance toward gut microbes and increase the risk of chronic gut inflammation. Our findings likely represent some of the earliest evidence of climate-induced heat stress mediated by the gut microbiome in a wild population. They offer critical insight into how rising temperatures may impact animal health through microbiome-linked pathways, with broader implications for wildlife facing accelerating climate change.</w:t>
+      </w:r>
+    </w:p>
+    <w:p>
+      <w:pPr>
+        <w:pStyle w:val="NormalWeb"/>
+      </w:pPr>
+    </w:p>
+    <w:p>
+      <w:pPr>
+        <w:pStyle w:val="NormalWeb"/>
+      </w:pPr>
+      <w:r>
+        <w:t xml:space="preserve">Our results highlight the crucial role of temperature in shaping essential gut microbiome functions in </w:t>
+      </w:r>
+      <w:r>
+        <w:t>a wild primate species and demonstrate how temperature is important for the relationship between the microbiome and the immune system.</w:t>
+      </w:r>
+      <w:r>
+        <w:t xml:space="preserve"> </w:t>
+      </w:r>
+      <w:r>
+        <w:t xml:space="preserve">While some of the </w:t>
+      </w:r>
+      <w:r>
+        <w:t xml:space="preserve">observed </w:t>
+      </w:r>
+      <w:r>
+        <w:t xml:space="preserve">responses to temperature may help preserve microbiome stability in the short term, most of the changes are unlikely to be sustainable over longer periods </w:t>
+      </w:r>
+      <w:r>
+        <w:t>and may compromise</w:t>
+      </w:r>
+      <w:r>
+        <w:t xml:space="preserve"> essential microbial functions</w:t>
+      </w:r>
+      <w:r>
+        <w:t>, creating</w:t>
+      </w:r>
+      <w:r>
+        <w:t xml:space="preserve"> downstream consequences for the host. The observed decline in obligate taxa and shifts in metabolic pathways and their relationship with neopterin indicate that the capuchins are likely experiencing periods of heat stress that could have consequences for microbiome-immune homeostasis. If prolonged these shifts could decrease host tolerance towards gut microbes and develop chronic gut inflammation. We are likely observing some of the first consequences of heat stress mediated by the gut microbiome in a wild population of primates. These findings provide key insight into how rising temperatures due to climate change may affect wild animals via microbiome-mediated mechanisms</w:t>
+      </w:r>
+    </w:p>
+    <w:p>
+      <w:pPr>
+        <w:pStyle w:val="NormalWeb"/>
+      </w:pPr>
+    </w:p>
+    <w:p>
+      <w:pPr>
+        <w:pStyle w:val="NormalWeb"/>
+      </w:pPr>
+    </w:p>
+    <w:p>
+      <w:pPr>
+        <w:pStyle w:val="NormalWeb"/>
+      </w:pPr>
+    </w:p>
+    <w:p>
+      <w:pPr>
+        <w:pStyle w:val="NormalWeb"/>
+      </w:pPr>
+      <w:r>
+        <w:lastRenderedPageBreak/>
+        <w:t xml:space="preserve"> The relationship between taxonomic and metabolic composition with temperature emphasizes that</w:t>
+      </w:r>
+      <w:r>
+        <w:t xml:space="preserve"> </w:t>
+      </w:r>
+      <w:r>
+        <w:t>heat-induced changes to the intestinal environment</w:t>
+      </w:r>
+      <w:r>
+        <w:t xml:space="preserve"> could compromise essential microbial functions and have downstream consequences for the host. </w:t>
+      </w:r>
+      <w:r>
+        <w:t xml:space="preserve">While some of the responses to temperature may help preserve microbiome stability in the short term, most of the changes show </w:t>
+      </w:r>
+      <w:proofErr w:type="spellStart"/>
+      <w:r>
+        <w:t>repsonses</w:t>
+      </w:r>
+      <w:proofErr w:type="spellEnd"/>
+      <w:r>
+        <w:t xml:space="preserve"> that are </w:t>
+      </w:r>
+      <w:r>
+        <w:t>unlikely to be sustainable over longer periods and may have consequences</w:t>
+      </w:r>
+      <w:r>
+        <w:t xml:space="preserve"> and may have consequences for essential microbial functions and downstream consequences for the host. </w:t>
+      </w:r>
+    </w:p>
+    <w:p>
+      <w:pPr>
+        <w:pStyle w:val="NormalWeb"/>
+      </w:pPr>
+    </w:p>
+    <w:p>
+      <w:pPr>
+        <w:pStyle w:val="NormalWeb"/>
+      </w:pPr>
+      <w:r>
+        <w:t>These shifts likely reflect the consequences on heat-induced changes to the intestinal environment that affect microbiome composition and essential functions.</w:t>
+      </w:r>
+    </w:p>
+    <w:p>
+      <w:pPr>
+        <w:pStyle w:val="NormalWeb"/>
+      </w:pPr>
+    </w:p>
+    <w:p>
+      <w:pPr>
+        <w:pStyle w:val="NormalWeb"/>
+      </w:pPr>
+    </w:p>
+    <w:p>
+      <w:pPr>
+        <w:pStyle w:val="NormalWeb"/>
+      </w:pPr>
+      <w:r>
+        <w:t>wild endotherms and demonstrate how temperature is related to microbiome-immune interactions that may affect host immune tolerance of gut microbes. These findings provide key insight into how rising temperatures due to climate change may affect wild animals via microbiome-mediated mechanisms</w:t>
+      </w:r>
+    </w:p>
+    <w:p>
+      <w:pPr>
+        <w:pStyle w:val="NormalWeb"/>
+      </w:pPr>
+      <w:r>
+        <w:t>are likely seeing the some of the first consequences of heat stress mediated by the gut microbiome!!!!!!!!!!</w:t>
+      </w:r>
+    </w:p>
+    <w:p>
+      <w:pPr>
+        <w:pStyle w:val="NormalWeb"/>
+      </w:pPr>
+      <w:r>
+        <w:t>First time we’ve observed something like this in the wild!</w:t>
+      </w:r>
+    </w:p>
+    <w:p>
+      <w:pPr>
+        <w:pStyle w:val="NormalWeb"/>
+      </w:pPr>
+      <w:r>
         <w:t>Reiterate the loop</w:t>
+      </w:r>
+    </w:p>
+    <w:p>
+      <w:r>
+        <w:t>These shifts likely reflect the consequences on heat-induced changes to the intestinal environment that affect microbiome composition and essential functions.</w:t>
       </w:r>
     </w:p>
     <w:p/>
@@ -5120,7 +5225,6 @@
     <w:p/>
     <w:p/>
     <w:p/>
-    <w:p/>
     <w:p>
       <w:commentRangeStart w:id="25"/>
       <w:commentRangeStart w:id="26"/>
@@ -5276,7 +5380,11 @@
         <w:t xml:space="preserve">Individual age was calculated by birth date for individuals younger than 7 years of age; </w:t>
       </w:r>
       <w:r>
-        <w:t xml:space="preserve">for individuals older than 7 years, age was estimated based on body condition by </w:t>
+        <w:t xml:space="preserve">for individuals older than 7 years, age was estimated based on body </w:t>
+      </w:r>
+      <w:r>
+        <w:lastRenderedPageBreak/>
+        <w:t xml:space="preserve">condition by </w:t>
       </w:r>
       <w:r>
         <w:t>a field team member</w:t>
@@ -5494,14 +5602,7 @@
         <w:rPr>
           <w:bCs/>
         </w:rPr>
-        <w:t xml:space="preserve">Amato Microbiome Lab at Northwestern University in Evanston IL for </w:t>
-      </w:r>
-      <w:r>
-        <w:rPr>
-          <w:bCs/>
-        </w:rPr>
-        <w:lastRenderedPageBreak/>
-        <w:t>DNA extraction and sequencing.</w:t>
+        <w:t>Amato Microbiome Lab at Northwestern University in Evanston IL for DNA extraction and sequencing.</w:t>
       </w:r>
       <w:r>
         <w:rPr>
@@ -5951,7 +6052,11 @@
         <w:commentReference w:id="31"/>
       </w:r>
       <w:r>
-        <w:t xml:space="preserve">. The C6 solution was prewarmed before the final elution step. Modifications to the manufacturer’s protocol align with other protocols designed for fecal samples containing high levels of plant fiber </w:t>
+        <w:t xml:space="preserve">. The C6 solution was prewarmed before the final elution </w:t>
+      </w:r>
+      <w:r>
+        <w:lastRenderedPageBreak/>
+        <w:t xml:space="preserve">step. Modifications to the manufacturer’s protocol align with other protocols designed for fecal samples containing high levels of plant fiber </w:t>
       </w:r>
       <w:r>
         <w:fldChar w:fldCharType="begin"/>
@@ -6265,7 +6370,6 @@
         <w:t xml:space="preserve"> by </w:t>
       </w:r>
       <w:r>
-        <w:lastRenderedPageBreak/>
         <w:t>applying the classify-</w:t>
       </w:r>
       <w:proofErr w:type="spellStart"/>
@@ -6426,7 +6530,11 @@
         <w:ind w:firstLine="720"/>
       </w:pPr>
       <w:r>
-        <w:t xml:space="preserve">Each gut microbiome sample was matched with relevant metadata to facilitate subsequent analyses. Microbiome samples were paired with the average neopterin value from a 7-day window, encompassing three days before, the day of, and three days after sample collection. Our time window provides a general measure of immune performance associated with the microbiome composition, enabling us to assess the relationship between the two. Maximum temperature (collected every 15 minutes) was averaged 15 days before sample collection. This time frame allowed us to evaluate the relationship between the microbiome and long-term trends in temperature. This temperature predictor has also been associated with changes in immune performance in this population </w:t>
+        <w:t xml:space="preserve">Each gut microbiome sample was matched with relevant metadata to facilitate subsequent analyses. Microbiome samples were paired with the average neopterin value from a 7-day window, encompassing three days before, the day of, and three days after sample collection. Our time window provides a general measure of immune performance associated with the microbiome composition, enabling us to assess the relationship between the two. Maximum temperature (collected every 15 minutes) was averaged 15 days before sample collection. This time frame allowed us to evaluate the relationship between the microbiome and long-term trends </w:t>
+      </w:r>
+      <w:r>
+        <w:lastRenderedPageBreak/>
+        <w:t xml:space="preserve">in temperature. This temperature predictor has also been associated with changes in immune performance in this population </w:t>
       </w:r>
       <w:r>
         <w:fldChar w:fldCharType="begin"/>
@@ -6551,11 +6659,7 @@
         <w:ind w:firstLine="720"/>
       </w:pPr>
       <w:r>
-        <w:t xml:space="preserve">To evaluate how gut microbiome composition is related to temperature, we generated metrics of community composition including alpha and beta diversity. Since rarefaction to </w:t>
-      </w:r>
-      <w:r>
-        <w:lastRenderedPageBreak/>
-        <w:t xml:space="preserve">account for differences in sequencing depth (i.e. choosing a fixed sequencing depth and randomly subsampling all samples to that depth) is strongly discouraged because it discards valuable data </w:t>
+        <w:t xml:space="preserve">To evaluate how gut microbiome composition is related to temperature, we generated metrics of community composition including alpha and beta diversity. Since rarefaction to account for differences in sequencing depth (i.e. choosing a fixed sequencing depth and randomly subsampling all samples to that depth) is strongly discouraged because it discards valuable data </w:t>
       </w:r>
       <w:r>
         <w:fldChar w:fldCharType="begin"/>
@@ -6716,15 +6820,7 @@
         <w:fldChar w:fldCharType="separate"/>
       </w:r>
       <w:r>
-        <w:t>(</w:t>
-      </w:r>
-      <w:proofErr w:type="spellStart"/>
-      <w:r>
-        <w:t>Palarea</w:t>
-      </w:r>
-      <w:proofErr w:type="spellEnd"/>
-      <w:r>
-        <w:t>-Albaladejo &amp; Martín-Fernández, 2015)</w:t>
+        <w:t>(Palarea-Albaladejo &amp; Martín-Fernández, 2015)</w:t>
       </w:r>
       <w:r>
         <w:fldChar w:fldCharType="end"/>
@@ -6853,7 +6949,11 @@
         <w:ind w:firstLine="720"/>
       </w:pPr>
       <w:r>
-        <w:t>To evaluate the relationship between temperature and community composition, we built mixed models using alpha diversity indices and the first four principal components as the outcome variables. Each community metric was modeled twice, and the model fit was compared using Akaike information criterion adjusted for small sample sizes (</w:t>
+        <w:t xml:space="preserve">To evaluate the relationship between temperature and community composition, we built mixed models using alpha diversity indices and the first four principal components as the </w:t>
+      </w:r>
+      <w:r>
+        <w:lastRenderedPageBreak/>
+        <w:t>outcome variables. Each community metric was modeled twice, and the model fit was compared using Akaike information criterion adjusted for small sample sizes (</w:t>
       </w:r>
       <w:proofErr w:type="spellStart"/>
       <w:r>
@@ -6962,11 +7062,7 @@
       <w:commentRangeStart w:id="45"/>
       <w:commentRangeStart w:id="46"/>
       <w:r>
-        <w:t xml:space="preserve">s therefore </w:t>
-      </w:r>
-      <w:r>
-        <w:lastRenderedPageBreak/>
-        <w:t xml:space="preserve">poorly suited  for drawing biologically meaningful conclusions </w:t>
+        <w:t xml:space="preserve">s therefore poorly suited  for drawing biologically meaningful conclusions </w:t>
       </w:r>
       <w:r>
         <w:fldChar w:fldCharType="begin"/>
@@ -7203,7 +7299,11 @@
       </w:r>
       <w:proofErr w:type="spellEnd"/>
       <w:r>
-        <w:t xml:space="preserve">, included all of the same predictors with an additional predictor for temperature. Both models included a random intercept for individuals to control for repeated sampling and an offset for the log-transformed number of reads to control for differences in sequencing depth between samples. Similar to our community feature analysis, fruit consumption was included to better isolate the relationship between temperature and individual taxa while accounting for diet components also related to temperature. However, we did not include diet diversity as a predictor to reduce model complexity and facilitate model convergence. We scaled all continuous predictors. Model weights were used to evaluate the importance of temperature as a predictor of individual taxa abundance. Taxa where </w:t>
+        <w:t xml:space="preserve">, included all of the same predictors with an additional predictor for temperature. Both models included a random intercept for individuals to control for repeated sampling and an offset for the log-transformed number of reads to control for differences in sequencing depth between samples. Similar to our community feature analysis, fruit consumption was included to better isolate the relationship between temperature and individual taxa while accounting for diet components also related to temperature. However, we did not include diet diversity as a predictor to reduce model complexity and facilitate model convergence. We scaled all continuous predictors. Model weights were used to evaluate the </w:t>
+      </w:r>
+      <w:r>
+        <w:lastRenderedPageBreak/>
+        <w:t xml:space="preserve">importance of temperature as a predictor of individual taxa abundance. Taxa where </w:t>
       </w:r>
       <w:proofErr w:type="spellStart"/>
       <w:r>
@@ -7373,11 +7473,7 @@
         <w:ind w:firstLine="720"/>
       </w:pPr>
       <w:r>
-        <w:t xml:space="preserve">To assess whether individual taxa exhibit a similar, non-linear relationship with temperature, we grouped taxa into clusters based on the shape of their temperature splines. For </w:t>
-      </w:r>
-      <w:r>
-        <w:lastRenderedPageBreak/>
-        <w:t xml:space="preserve">each taxon where, </w:t>
+        <w:t xml:space="preserve">To assess whether individual taxa exhibit a similar, non-linear relationship with temperature, we grouped taxa into clusters based on the shape of their temperature splines. For each taxon where, </w:t>
       </w:r>
       <w:proofErr w:type="spellStart"/>
       <w:r>
@@ -7543,7 +7639,11 @@
         <w:ind w:firstLine="720"/>
       </w:pPr>
       <w:r>
-        <w:t xml:space="preserve">To assess whether the relationship between temperature and individual taxa is associated with immune performance, we employed the same model comparison approach but used taxon abundances as outcome variables. First, we filtered for taxa that were temperature-sensitive (i.e. </w:t>
+        <w:t xml:space="preserve">To assess whether the relationship between temperature and individual taxa is associated with immune performance, we employed the same model comparison approach but used taxon </w:t>
+      </w:r>
+      <w:r>
+        <w:lastRenderedPageBreak/>
+        <w:t xml:space="preserve">abundances as outcome variables. First, we filtered for taxa that were temperature-sensitive (i.e. </w:t>
       </w:r>
       <w:proofErr w:type="spellStart"/>
       <w:r>
@@ -7637,6 +7737,7 @@
           <w:noProof/>
           <w14:ligatures w14:val="standardContextual"/>
         </w:rPr>
+        <w:lastRenderedPageBreak/>
         <w:drawing>
           <wp:anchor distT="0" distB="0" distL="114300" distR="114300" simplePos="0" relativeHeight="251658240" behindDoc="0" locked="0" layoutInCell="1" allowOverlap="1" wp14:anchorId="3B504E8E" wp14:editId="7137F560">
             <wp:simplePos x="0" y="0"/>
@@ -7964,10 +8065,7 @@
         <w:t xml:space="preserve"> genera with ≥</w:t>
       </w:r>
       <w:r>
-        <w:t xml:space="preserve"> </w:t>
-      </w:r>
-      <w:r>
-        <w:t xml:space="preserve">0.2% average </w:t>
+        <w:t xml:space="preserve"> 0.2% average </w:t>
       </w:r>
       <w:r>
         <w:t>relative abundance. Branch color indicates model weight for the temperature model</w:t>
@@ -8079,19 +8177,10 @@
         <w:t xml:space="preserve">Pathways </w:t>
       </w:r>
       <w:r>
-        <w:t xml:space="preserve">are grouped into </w:t>
-      </w:r>
-      <w:r>
-        <w:t>five functional</w:t>
-      </w:r>
-      <w:r>
-        <w:t xml:space="preserve"> </w:t>
-      </w:r>
-      <w:r>
-        <w:t xml:space="preserve">categories </w:t>
-      </w:r>
-      <w:r>
-        <w:t>(P</w:t>
+        <w:t>are grouped into five functional</w:t>
+      </w:r>
+      <w:r>
+        <w:t xml:space="preserve"> categories (P</w:t>
       </w:r>
       <w:r>
         <w:t xml:space="preserve">anels </w:t>
@@ -8107,19 +8196,13 @@
         <w:t>)</w:t>
       </w:r>
       <w:r>
-        <w:t xml:space="preserve"> </w:t>
-      </w:r>
-      <w:r>
-        <w:t xml:space="preserve">based on shared biological roles and </w:t>
+        <w:t xml:space="preserve"> based on shared biological roles and </w:t>
       </w:r>
       <w:r>
         <w:t xml:space="preserve">their associations </w:t>
       </w:r>
       <w:r>
-        <w:t>with temperature</w:t>
-      </w:r>
-      <w:r>
-        <w:t xml:space="preserve">. </w:t>
+        <w:t xml:space="preserve">with temperature. </w:t>
       </w:r>
       <w:r>
         <w:t>The</w:t>
@@ -8156,40 +8239,13 @@
         <w:t xml:space="preserve"> hypothesized physiological cascade induced by exposure to high temperatures</w:t>
       </w:r>
       <w:r>
-        <w:t xml:space="preserve">, in which </w:t>
-      </w:r>
-      <w:r>
-        <w:t>redox imbalance, the decline of obligate anaerobes, and disruption of gut-immune homeostasis</w:t>
-      </w:r>
-      <w:r>
-        <w:t xml:space="preserve"> form a negative feedback loop. </w:t>
-      </w:r>
-      <w:r>
-        <w:t xml:space="preserve">Bidirectional arrows highlight </w:t>
-      </w:r>
-      <w:r>
-        <w:t xml:space="preserve">that each </w:t>
-      </w:r>
-      <w:r>
-        <w:t xml:space="preserve">relationship </w:t>
-      </w:r>
-      <w:r>
-        <w:t>likely amplifies the others and may lead to</w:t>
+        <w:t>, in which redox imbalance, the decline of obligate anaerobes, and disruption of gut-immune homeostasis form a negative feedback loop. Bidirectional arrows highlight that each relationship likely amplifies the others and may lead to</w:t>
       </w:r>
       <w:r>
         <w:t xml:space="preserve"> </w:t>
       </w:r>
       <w:r>
-        <w:t>chronic gut inflammation</w:t>
-      </w:r>
-      <w:r>
-        <w:t xml:space="preserve"> and </w:t>
-      </w:r>
-      <w:r>
-        <w:t>negative health outcomes for the host</w:t>
-      </w:r>
-      <w:r>
-        <w:t xml:space="preserve">. </w:t>
+        <w:t xml:space="preserve">chronic gut inflammation and negative health outcomes for the host. </w:t>
       </w:r>
     </w:p>
     <w:p>
@@ -8431,32 +8487,17 @@
         <w:t xml:space="preserve">: </w:t>
       </w:r>
       <w:r>
-        <w:t xml:space="preserve">The relationship between </w:t>
-      </w:r>
-      <w:r>
-        <w:t>metabolic path</w:t>
+        <w:t>The relationship between metabolic path</w:t>
       </w:r>
       <w:r>
         <w:t>w</w:t>
       </w:r>
       <w:r>
-        <w:t>ay</w:t>
-      </w:r>
-      <w:r>
-        <w:t xml:space="preserve"> abundance and temperature plotted across </w:t>
+        <w:t xml:space="preserve">ay abundance and temperature plotted across </w:t>
       </w:r>
       <w:r>
         <w:lastRenderedPageBreak/>
-        <w:t>two</w:t>
-      </w:r>
-      <w:r>
-        <w:t xml:space="preserve"> distinct ranges of neopterin concentration. There are two main effects. Row</w:t>
-      </w:r>
-      <w:r>
-        <w:t>s</w:t>
-      </w:r>
-      <w:r>
-        <w:t xml:space="preserve"> </w:t>
+        <w:t xml:space="preserve">two distinct ranges of neopterin concentration. There are two main effects. Rows </w:t>
       </w:r>
       <w:r>
         <w:rPr>
@@ -8483,25 +8524,7 @@
         <w:t xml:space="preserve">B </w:t>
       </w:r>
       <w:r>
-        <w:t xml:space="preserve"> include </w:t>
-      </w:r>
-      <w:r>
-        <w:t>pathways</w:t>
-      </w:r>
-      <w:r>
-        <w:t xml:space="preserve"> for which the relationship between temperature and abundance becomes </w:t>
-      </w:r>
-      <w:r>
-        <w:t>increasingly positive</w:t>
-      </w:r>
-      <w:r>
-        <w:t xml:space="preserve"> at higher neopterin</w:t>
-      </w:r>
-      <w:r>
-        <w:t xml:space="preserve"> either through an </w:t>
-      </w:r>
-      <w:r>
-        <w:t xml:space="preserve">increasingly positive slope (Row </w:t>
+        <w:t xml:space="preserve"> include pathways for which the relationship between temperature and abundance becomes increasingly positive at higher neopterin either through an increasingly positive slope (Row </w:t>
       </w:r>
       <w:r>
         <w:rPr>
@@ -8544,25 +8567,7 @@
         <w:t>-E</w:t>
       </w:r>
       <w:r>
-        <w:t xml:space="preserve"> include </w:t>
-      </w:r>
-      <w:r>
-        <w:t>pathways</w:t>
-      </w:r>
-      <w:r>
-        <w:t xml:space="preserve"> for which the relationship becomes </w:t>
-      </w:r>
-      <w:r>
-        <w:t>increasingly negative</w:t>
-      </w:r>
-      <w:r>
-        <w:t xml:space="preserve">, either through an increasingly </w:t>
-      </w:r>
-      <w:r>
-        <w:t>negative</w:t>
-      </w:r>
-      <w:r>
-        <w:t xml:space="preserve"> slope (Row </w:t>
+        <w:t xml:space="preserve"> include pathways for which the relationship becomes increasingly negative, either through an increasingly negative slope (Row </w:t>
       </w:r>
       <w:r>
         <w:rPr>
@@ -8572,25 +8577,7 @@
         <w:t>C</w:t>
       </w:r>
       <w:r>
-        <w:t>)</w:t>
-      </w:r>
-      <w:r>
-        <w:t xml:space="preserve">, </w:t>
-      </w:r>
-      <w:r>
-        <w:t xml:space="preserve">a slope that switches from </w:t>
-      </w:r>
-      <w:r>
-        <w:t>positive</w:t>
-      </w:r>
-      <w:r>
-        <w:t xml:space="preserve"> to </w:t>
-      </w:r>
-      <w:r>
-        <w:t>negative</w:t>
-      </w:r>
-      <w:r>
-        <w:t xml:space="preserve"> (Row </w:t>
+        <w:t xml:space="preserve">), a slope that switches from positive to negative (Row </w:t>
       </w:r>
       <w:r>
         <w:rPr>
@@ -8600,10 +8587,7 @@
         <w:t>D</w:t>
       </w:r>
       <w:r>
-        <w:t>)</w:t>
-      </w:r>
-      <w:r>
-        <w:t xml:space="preserve">, or a slope that </w:t>
+        <w:t xml:space="preserve">), or a slope that </w:t>
       </w:r>
       <w:r>
         <w:t xml:space="preserve">becomes less positive (Row </w:t>
@@ -9014,16 +8998,7 @@
         <w:t xml:space="preserve"> show the results for metabolic pathway diversity. Results show </w:t>
       </w:r>
       <w:r>
-        <w:t xml:space="preserve">that the relationship between temperature and beta diversity is associated with neopterin concentration for both </w:t>
-      </w:r>
-      <w:r>
-        <w:t>taxonomic and metabolic community composition</w:t>
-      </w:r>
-      <w:r>
-        <w:t xml:space="preserve">, but the </w:t>
-      </w:r>
-      <w:r>
-        <w:t>relationship between alpha diversity and temperature is independent of neopterin concentration.</w:t>
+        <w:t>that the relationship between temperature and beta diversity is associated with neopterin concentration for both taxonomic and metabolic community composition, but the relationship between alpha diversity and temperature is independent of neopterin concentration.</w:t>
       </w:r>
     </w:p>
     <w:p/>

</xml_diff>